<commit_message>
cleaned up Census uploader validate to better handle problem values
</commit_message>
<xml_diff>
--- a/installer/How to Create HEM5.1 Install Package.docx
+++ b/installer/How to Create HEM5.1 Install Package.docx
@@ -163,13 +163,7 @@
         <w:t xml:space="preserve"> --</w:t>
       </w:r>
       <w:r>
-        <w:t xml:space="preserve">clean </w:t>
-      </w:r>
-      <w:r>
-        <w:t>.\installer\</w:t>
-      </w:r>
-      <w:r>
-        <w:t>HEM5</w:t>
+        <w:t>clean HEM5</w:t>
       </w:r>
       <w:r>
         <w:t>.1</w:t>

</xml_diff>